<commit_message>
Dogfood samples, one-command launcher, PROJECT.md, and doc corrections
- examples/dogfood/: a full set of documents docloom generated from its own
  PROJECT.md (a deck, a 95-block whitepaper in 4 formats, an infographic, a
  workbook, and two architecture diagrams), plus a self-contained render script.
  This is the real output the system produces; the root README points to it.
- PROJECT.md: an accurate, fact-checked project explainer suitable as a source.
- studio.ps1 / studio.cmd / studio.sh: one-command bring-up (deps + web build +
  server on one port), with a resvg self-heal so exports can't silently blank.
  .gitattributes pins the launchers' line endings.
- Docs: corrected the D2-vs-Diagram-IR split description, the [pdf,diagrams]
  extra, podcast/artifact-kind counts, and removed stale internal process docs.
</commit_message>
<xml_diff>
--- a/examples/output/showcase.docx
+++ b/examples/output/showcase.docx
@@ -41,6 +41,7 @@
     <w:p>
       <w:pPr>
         <w:pStyle w:val="Heading2"/>
+        <w:keepNext/>
       </w:pPr>
       <w:r>
         <w:t>Executive summary</w:t>
@@ -318,6 +319,7 @@
     <w:p>
       <w:pPr>
         <w:pStyle w:val="Heading2"/>
+        <w:keepNext/>
       </w:pPr>
       <w:r>
         <w:t>The structural shift</w:t>
@@ -425,6 +427,7 @@
     <w:p>
       <w:pPr>
         <w:pStyle w:val="Heading2"/>
+        <w:keepNext/>
       </w:pPr>
       <w:r>
         <w:t>The productivity case</w:t>
@@ -585,6 +588,9 @@
     </w:tbl>
     <w:p/>
     <w:p>
+      <w:pPr>
+        <w:keepNext/>
+      </w:pPr>
       <w:r>
         <w:rPr>
           <w:b/>
@@ -594,100 +600,49 @@
         <w:t>Uninterrupted focus blocks per engineer per day</w:t>
       </w:r>
     </w:p>
-    <w:tbl>
-      <w:tblPr>
-        <w:tblStyle w:val="TableGrid"/>
-        <w:tblW w:type="auto" w:w="0"/>
-        <w:tblLook w:firstColumn="1" w:firstRow="1" w:lastColumn="0" w:lastRow="0" w:noHBand="0" w:noVBand="1" w:val="04A0"/>
-      </w:tblPr>
-      <w:tblGrid>
-        <w:gridCol w:w="2880"/>
-        <w:gridCol w:w="2880"/>
-        <w:gridCol w:w="2880"/>
-      </w:tblGrid>
-      <w:tr>
-        <w:tc>
-          <w:tcPr>
-            <w:tcW w:type="dxa" w:w="2880"/>
-            <w:shd w:val="clear" w:fill="4F46E5"/>
-          </w:tcPr>
-          <w:p>
-            <w:r>
-              <w:rPr>
-                <w:b/>
-                <w:color w:val="FFFFFF"/>
-              </w:rPr>
-            </w:r>
-          </w:p>
-        </w:tc>
-        <w:tc>
-          <w:tcPr>
-            <w:tcW w:type="dxa" w:w="2880"/>
-            <w:shd w:val="clear" w:fill="4F46E5"/>
-          </w:tcPr>
-          <w:p>
-            <w:r>
-              <w:rPr>
-                <w:b/>
-                <w:color w:val="FFFFFF"/>
-              </w:rPr>
-              <w:t>Meeting-heavy</w:t>
-            </w:r>
-          </w:p>
-        </w:tc>
-        <w:tc>
-          <w:tcPr>
-            <w:tcW w:type="dxa" w:w="2880"/>
-            <w:shd w:val="clear" w:fill="4F46E5"/>
-          </w:tcPr>
-          <w:p>
-            <w:r>
-              <w:rPr>
-                <w:b/>
-                <w:color w:val="FFFFFF"/>
-              </w:rPr>
-              <w:t>Async-mature</w:t>
-            </w:r>
-          </w:p>
-        </w:tc>
-      </w:tr>
-      <w:tr>
-        <w:tc>
-          <w:tcPr>
-            <w:tcW w:type="dxa" w:w="2880"/>
-          </w:tcPr>
-          <w:p>
-            <w:r>
-              <w:t>blocks / day</w:t>
-            </w:r>
-          </w:p>
-        </w:tc>
-        <w:tc>
-          <w:tcPr>
-            <w:tcW w:type="dxa" w:w="2880"/>
-          </w:tcPr>
-          <w:p>
-            <w:r>
-              <w:t>1.4</w:t>
-            </w:r>
-          </w:p>
-        </w:tc>
-        <w:tc>
-          <w:tcPr>
-            <w:tcW w:type="dxa" w:w="2880"/>
-          </w:tcPr>
-          <w:p>
-            <w:r>
-              <w:t>3.2</w:t>
-            </w:r>
-          </w:p>
-        </w:tc>
-      </w:tr>
-    </w:tbl>
-    <w:p/>
+    <w:p>
+      <w:pPr>
+        <w:jc w:val="center"/>
+      </w:pPr>
+      <w:r>
+        <w:drawing>
+          <wp:inline xmlns:a="http://schemas.openxmlformats.org/drawingml/2006/main" xmlns:pic="http://schemas.openxmlformats.org/drawingml/2006/picture">
+            <wp:extent cx="5486400" cy="3257550"/>
+            <wp:docPr id="1" name="Picture 1"/>
+            <wp:cNvGraphicFramePr>
+              <a:graphicFrameLocks noChangeAspect="1"/>
+            </wp:cNvGraphicFramePr>
+            <a:graphic>
+              <a:graphicData uri="http://schemas.openxmlformats.org/drawingml/2006/picture">
+                <pic:pic>
+                  <pic:nvPicPr>
+                    <pic:cNvPr id="0" name="image.png"/>
+                    <pic:cNvPicPr/>
+                  </pic:nvPicPr>
+                  <pic:blipFill>
+                    <a:blip r:embed="rId9"/>
+                    <a:stretch>
+                      <a:fillRect/>
+                    </a:stretch>
+                  </pic:blipFill>
+                  <pic:spPr>
+                    <a:xfrm>
+                      <a:off x="0" y="0"/>
+                      <a:ext cx="5486400" cy="3257550"/>
+                    </a:xfrm>
+                    <a:prstGeom prst="rect"/>
+                  </pic:spPr>
+                </pic:pic>
+              </a:graphicData>
+            </a:graphic>
+          </wp:inline>
+        </w:drawing>
+      </w:r>
+    </w:p>
     <w:p>
       <w:pPr>
         <w:pStyle w:val="Heading2"/>
+        <w:keepNext/>
       </w:pPr>
       <w:r>
         <w:t>The meeting problem</w:t>
@@ -867,6 +822,9 @@
     </w:tbl>
     <w:p/>
     <w:p>
+      <w:pPr>
+        <w:keepNext/>
+      </w:pPr>
       <w:r>
         <w:rPr>
           <w:b/>
@@ -876,123 +834,51 @@
         <w:t>Sync meeting share of collaboration time</w:t>
       </w:r>
     </w:p>
-    <w:tbl>
-      <w:tblPr>
-        <w:tblStyle w:val="TableGrid"/>
-        <w:tblW w:type="auto" w:w="0"/>
-        <w:tblLook w:firstColumn="1" w:firstRow="1" w:lastColumn="0" w:lastRow="0" w:noHBand="0" w:noVBand="1" w:val="04A0"/>
-      </w:tblPr>
-      <w:tblGrid>
-        <w:gridCol w:w="2160"/>
-        <w:gridCol w:w="2160"/>
-        <w:gridCol w:w="2160"/>
-        <w:gridCol w:w="2160"/>
-      </w:tblGrid>
-      <w:tr>
-        <w:tc>
-          <w:tcPr>
-            <w:tcW w:type="dxa" w:w="2160"/>
-            <w:shd w:val="clear" w:fill="4F46E5"/>
-          </w:tcPr>
-          <w:p>
-            <w:r>
-              <w:rPr>
-                <w:b/>
-                <w:color w:val="FFFFFF"/>
-              </w:rPr>
-            </w:r>
-          </w:p>
-        </w:tc>
-        <w:tc>
-          <w:tcPr>
-            <w:tcW w:type="dxa" w:w="2160"/>
-            <w:shd w:val="clear" w:fill="4F46E5"/>
-          </w:tcPr>
-          <w:p>
-            <w:r>
-              <w:rPr>
-                <w:b/>
-                <w:color w:val="FFFFFF"/>
-              </w:rPr>
-              <w:t>2022</w:t>
-            </w:r>
-          </w:p>
-        </w:tc>
-        <w:tc>
-          <w:tcPr>
-            <w:tcW w:type="dxa" w:w="2160"/>
-            <w:shd w:val="clear" w:fill="4F46E5"/>
-          </w:tcPr>
-          <w:p>
-            <w:r>
-              <w:rPr>
-                <w:b/>
-                <w:color w:val="FFFFFF"/>
-              </w:rPr>
-              <w:t>2024</w:t>
-            </w:r>
-          </w:p>
-        </w:tc>
-        <w:tc>
-          <w:tcPr>
-            <w:tcW w:type="dxa" w:w="2160"/>
-            <w:shd w:val="clear" w:fill="4F46E5"/>
-          </w:tcPr>
-          <w:p>
-            <w:r>
-              <w:rPr>
-                <w:b/>
-                <w:color w:val="FFFFFF"/>
-              </w:rPr>
-              <w:t>2026</w:t>
-            </w:r>
-          </w:p>
-        </w:tc>
-      </w:tr>
-      <w:tr>
-        <w:tc>
-          <w:tcPr>
-            <w:tcW w:type="dxa" w:w="2160"/>
-          </w:tcPr>
-          <w:p>
-            <w:r>
-              <w:t>% of hours</w:t>
-            </w:r>
-          </w:p>
-        </w:tc>
-        <w:tc>
-          <w:tcPr>
-            <w:tcW w:type="dxa" w:w="2160"/>
-          </w:tcPr>
-          <w:p>
-            <w:r>
-              <w:t>31</w:t>
-            </w:r>
-          </w:p>
-        </w:tc>
-        <w:tc>
-          <w:tcPr>
-            <w:tcW w:type="dxa" w:w="2160"/>
-          </w:tcPr>
-          <w:p>
-            <w:r>
-              <w:t>24</w:t>
-            </w:r>
-          </w:p>
-        </w:tc>
-        <w:tc>
-          <w:tcPr>
-            <w:tcW w:type="dxa" w:w="2160"/>
-          </w:tcPr>
-          <w:p>
-            <w:r>
-              <w:t>18</w:t>
-            </w:r>
-          </w:p>
-        </w:tc>
-      </w:tr>
-    </w:tbl>
     <w:p>
+      <w:pPr>
+        <w:keepNext/>
+        <w:jc w:val="center"/>
+      </w:pPr>
+      <w:r>
+        <w:drawing>
+          <wp:inline xmlns:a="http://schemas.openxmlformats.org/drawingml/2006/main" xmlns:pic="http://schemas.openxmlformats.org/drawingml/2006/picture">
+            <wp:extent cx="5486400" cy="3257550"/>
+            <wp:docPr id="2" name="Picture 2"/>
+            <wp:cNvGraphicFramePr>
+              <a:graphicFrameLocks noChangeAspect="1"/>
+            </wp:cNvGraphicFramePr>
+            <a:graphic>
+              <a:graphicData uri="http://schemas.openxmlformats.org/drawingml/2006/picture">
+                <pic:pic>
+                  <pic:nvPicPr>
+                    <pic:cNvPr id="0" name="image.png"/>
+                    <pic:cNvPicPr/>
+                  </pic:nvPicPr>
+                  <pic:blipFill>
+                    <a:blip r:embed="rId10"/>
+                    <a:stretch>
+                      <a:fillRect/>
+                    </a:stretch>
+                  </pic:blipFill>
+                  <pic:spPr>
+                    <a:xfrm>
+                      <a:off x="0" y="0"/>
+                      <a:ext cx="5486400" cy="3257550"/>
+                    </a:xfrm>
+                    <a:prstGeom prst="rect"/>
+                  </pic:spPr>
+                </pic:pic>
+              </a:graphicData>
+            </a:graphic>
+          </wp:inline>
+        </w:drawing>
+      </w:r>
+    </w:p>
+    <w:p>
+      <w:pPr>
+        <w:keepLines/>
+        <w:jc w:val="center"/>
+      </w:pPr>
       <w:r>
         <w:rPr>
           <w:i/>
@@ -1005,6 +891,7 @@
     <w:p>
       <w:pPr>
         <w:pStyle w:val="Heading2"/>
+        <w:keepNext/>
       </w:pPr>
       <w:r>
         <w:t>Adoption across organizations</w:t>
@@ -1116,17 +1003,22 @@
       <w:tblPr>
         <w:tblStyle w:val="TableGrid"/>
         <w:tblW w:type="auto" w:w="0"/>
+        <w:tblLayout w:type="fixed"/>
         <w:tblLook w:firstColumn="1" w:firstRow="1" w:lastColumn="0" w:lastRow="0" w:noHBand="0" w:noVBand="1" w:val="04A0"/>
       </w:tblPr>
       <w:tblGrid>
-        <w:gridCol w:w="2880"/>
-        <w:gridCol w:w="2880"/>
-        <w:gridCol w:w="2880"/>
+        <w:gridCol w:w="2492"/>
+        <w:gridCol w:w="3157"/>
+        <w:gridCol w:w="2991"/>
       </w:tblGrid>
       <w:tr>
+        <w:trPr>
+          <w:tblHeader/>
+          <w:cantSplit/>
+        </w:trPr>
         <w:tc>
           <w:tcPr>
-            <w:tcW w:type="dxa" w:w="2880"/>
+            <w:tcW w:type="dxa" w:w="2492"/>
             <w:shd w:val="clear" w:fill="4F46E5"/>
           </w:tcPr>
           <w:p>
@@ -1141,7 +1033,7 @@
         </w:tc>
         <w:tc>
           <w:tcPr>
-            <w:tcW w:type="dxa" w:w="2880"/>
+            <w:tcW w:type="dxa" w:w="3157"/>
             <w:shd w:val="clear" w:fill="4F46E5"/>
           </w:tcPr>
           <w:p>
@@ -1156,7 +1048,7 @@
         </w:tc>
         <w:tc>
           <w:tcPr>
-            <w:tcW w:type="dxa" w:w="2880"/>
+            <w:tcW w:type="dxa" w:w="2991"/>
             <w:shd w:val="clear" w:fill="4F46E5"/>
           </w:tcPr>
           <w:p>
@@ -1171,9 +1063,12 @@
         </w:tc>
       </w:tr>
       <w:tr>
+        <w:trPr>
+          <w:cantSplit/>
+        </w:trPr>
         <w:tc>
           <w:tcPr>
-            <w:tcW w:type="dxa" w:w="2880"/>
+            <w:tcW w:type="dxa" w:w="2492"/>
           </w:tcPr>
           <w:p>
             <w:r>
@@ -1183,7 +1078,7 @@
         </w:tc>
         <w:tc>
           <w:tcPr>
-            <w:tcW w:type="dxa" w:w="2880"/>
+            <w:tcW w:type="dxa" w:w="3157"/>
           </w:tcPr>
           <w:p>
             <w:r>
@@ -1193,7 +1088,7 @@
         </w:tc>
         <w:tc>
           <w:tcPr>
-            <w:tcW w:type="dxa" w:w="2880"/>
+            <w:tcW w:type="dxa" w:w="2991"/>
           </w:tcPr>
           <w:p>
             <w:r>
@@ -1203,9 +1098,12 @@
         </w:tc>
       </w:tr>
       <w:tr>
+        <w:trPr>
+          <w:cantSplit/>
+        </w:trPr>
         <w:tc>
           <w:tcPr>
-            <w:tcW w:type="dxa" w:w="2880"/>
+            <w:tcW w:type="dxa" w:w="2492"/>
             <w:shd w:val="clear" w:fill="F4F6FB"/>
           </w:tcPr>
           <w:p>
@@ -1216,7 +1114,7 @@
         </w:tc>
         <w:tc>
           <w:tcPr>
-            <w:tcW w:type="dxa" w:w="2880"/>
+            <w:tcW w:type="dxa" w:w="3157"/>
             <w:shd w:val="clear" w:fill="F4F6FB"/>
           </w:tcPr>
           <w:p>
@@ -1227,7 +1125,7 @@
         </w:tc>
         <w:tc>
           <w:tcPr>
-            <w:tcW w:type="dxa" w:w="2880"/>
+            <w:tcW w:type="dxa" w:w="2991"/>
             <w:shd w:val="clear" w:fill="F4F6FB"/>
           </w:tcPr>
           <w:p>
@@ -1238,11 +1136,17 @@
         </w:tc>
       </w:tr>
       <w:tr>
+        <w:trPr>
+          <w:cantSplit/>
+        </w:trPr>
         <w:tc>
           <w:tcPr>
-            <w:tcW w:type="dxa" w:w="2880"/>
+            <w:tcW w:type="dxa" w:w="2492"/>
           </w:tcPr>
           <w:p>
+            <w:pPr>
+              <w:keepNext/>
+            </w:pPr>
             <w:r>
               <w:t>Bottom quartile</w:t>
             </w:r>
@@ -1250,9 +1154,12 @@
         </w:tc>
         <w:tc>
           <w:tcPr>
-            <w:tcW w:type="dxa" w:w="2880"/>
+            <w:tcW w:type="dxa" w:w="3157"/>
           </w:tcPr>
           <w:p>
+            <w:pPr>
+              <w:keepNext/>
+            </w:pPr>
             <w:r>
               <w:t>17%</w:t>
             </w:r>
@@ -1260,9 +1167,12 @@
         </w:tc>
         <w:tc>
           <w:tcPr>
-            <w:tcW w:type="dxa" w:w="2880"/>
+            <w:tcW w:type="dxa" w:w="2991"/>
           </w:tcPr>
           <w:p>
+            <w:pPr>
+              <w:keepNext/>
+            </w:pPr>
             <w:r>
               <w:t>1.4</w:t>
             </w:r>
@@ -1271,6 +1181,9 @@
       </w:tr>
     </w:tbl>
     <w:p>
+      <w:pPr>
+        <w:keepLines/>
+      </w:pPr>
       <w:r>
         <w:rPr>
           <w:i/>
@@ -1283,6 +1196,7 @@
     <w:p>
       <w:pPr>
         <w:pStyle w:val="Heading2"/>
+        <w:keepNext/>
       </w:pPr>
       <w:r>
         <w:t>A practical playbook</w:t>
@@ -1465,6 +1379,7 @@
     <w:p>
       <w:pPr>
         <w:pStyle w:val="Heading2"/>
+        <w:keepNext/>
       </w:pPr>
       <w:r>
         <w:t>Common pitfalls</w:t>
@@ -1570,6 +1485,7 @@
     <w:p>
       <w:pPr>
         <w:pStyle w:val="Heading2"/>
+        <w:keepNext/>
       </w:pPr>
       <w:r>
         <w:t>Outlook 2027</w:t>
@@ -1685,6 +1601,7 @@
     <w:p>
       <w:pPr>
         <w:pStyle w:val="Heading2"/>
+        <w:keepNext/>
       </w:pPr>
       <w:r>
         <w:rPr>
@@ -1697,18 +1614,23 @@
       <w:tblPr>
         <w:tblStyle w:val="TableGrid"/>
         <w:tblW w:type="auto" w:w="0"/>
+        <w:tblLayout w:type="fixed"/>
         <w:tblLook w:firstColumn="1" w:firstRow="1" w:lastColumn="0" w:lastRow="0" w:noHBand="0" w:noVBand="1" w:val="04A0"/>
       </w:tblPr>
       <w:tblGrid>
-        <w:gridCol w:w="2160"/>
-        <w:gridCol w:w="2160"/>
-        <w:gridCol w:w="2160"/>
-        <w:gridCol w:w="2160"/>
+        <w:gridCol w:w="1206"/>
+        <w:gridCol w:w="2813"/>
+        <w:gridCol w:w="2411"/>
+        <w:gridCol w:w="2210"/>
       </w:tblGrid>
       <w:tr>
+        <w:trPr>
+          <w:tblHeader/>
+          <w:cantSplit/>
+        </w:trPr>
         <w:tc>
           <w:tcPr>
-            <w:tcW w:type="dxa" w:w="2160"/>
+            <w:tcW w:type="dxa" w:w="1206"/>
             <w:shd w:val="clear" w:fill="4F46E5"/>
           </w:tcPr>
           <w:p>
@@ -1723,7 +1645,7 @@
         </w:tc>
         <w:tc>
           <w:tcPr>
-            <w:tcW w:type="dxa" w:w="2160"/>
+            <w:tcW w:type="dxa" w:w="2813"/>
             <w:shd w:val="clear" w:fill="4F46E5"/>
           </w:tcPr>
           <w:p>
@@ -1738,7 +1660,7 @@
         </w:tc>
         <w:tc>
           <w:tcPr>
-            <w:tcW w:type="dxa" w:w="2160"/>
+            <w:tcW w:type="dxa" w:w="2411"/>
             <w:shd w:val="clear" w:fill="4F46E5"/>
           </w:tcPr>
           <w:p>
@@ -1753,7 +1675,7 @@
         </w:tc>
         <w:tc>
           <w:tcPr>
-            <w:tcW w:type="dxa" w:w="2160"/>
+            <w:tcW w:type="dxa" w:w="2210"/>
             <w:shd w:val="clear" w:fill="4F46E5"/>
           </w:tcPr>
           <w:p>
@@ -1768,9 +1690,12 @@
         </w:tc>
       </w:tr>
       <w:tr>
+        <w:trPr>
+          <w:cantSplit/>
+        </w:trPr>
         <w:tc>
           <w:tcPr>
-            <w:tcW w:type="dxa" w:w="2160"/>
+            <w:tcW w:type="dxa" w:w="1206"/>
           </w:tcPr>
           <w:p>
             <w:r>
@@ -1780,7 +1705,7 @@
         </w:tc>
         <w:tc>
           <w:tcPr>
-            <w:tcW w:type="dxa" w:w="2160"/>
+            <w:tcW w:type="dxa" w:w="2813"/>
           </w:tcPr>
           <w:p>
             <w:r>
@@ -1790,7 +1715,7 @@
         </w:tc>
         <w:tc>
           <w:tcPr>
-            <w:tcW w:type="dxa" w:w="2160"/>
+            <w:tcW w:type="dxa" w:w="2411"/>
           </w:tcPr>
           <w:p>
             <w:r>
@@ -1800,7 +1725,7 @@
         </w:tc>
         <w:tc>
           <w:tcPr>
-            <w:tcW w:type="dxa" w:w="2160"/>
+            <w:tcW w:type="dxa" w:w="2210"/>
           </w:tcPr>
           <w:p>
             <w:r>
@@ -1810,9 +1735,12 @@
         </w:tc>
       </w:tr>
       <w:tr>
+        <w:trPr>
+          <w:cantSplit/>
+        </w:trPr>
         <w:tc>
           <w:tcPr>
-            <w:tcW w:type="dxa" w:w="2160"/>
+            <w:tcW w:type="dxa" w:w="1206"/>
             <w:shd w:val="clear" w:fill="F4F6FB"/>
           </w:tcPr>
           <w:p>
@@ -1823,7 +1751,7 @@
         </w:tc>
         <w:tc>
           <w:tcPr>
-            <w:tcW w:type="dxa" w:w="2160"/>
+            <w:tcW w:type="dxa" w:w="2813"/>
             <w:shd w:val="clear" w:fill="F4F6FB"/>
           </w:tcPr>
           <w:p>
@@ -1834,7 +1762,7 @@
         </w:tc>
         <w:tc>
           <w:tcPr>
-            <w:tcW w:type="dxa" w:w="2160"/>
+            <w:tcW w:type="dxa" w:w="2411"/>
             <w:shd w:val="clear" w:fill="F4F6FB"/>
           </w:tcPr>
           <w:p>
@@ -1845,7 +1773,7 @@
         </w:tc>
         <w:tc>
           <w:tcPr>
-            <w:tcW w:type="dxa" w:w="2160"/>
+            <w:tcW w:type="dxa" w:w="2210"/>
             <w:shd w:val="clear" w:fill="F4F6FB"/>
           </w:tcPr>
           <w:p>
@@ -1856,9 +1784,12 @@
         </w:tc>
       </w:tr>
       <w:tr>
+        <w:trPr>
+          <w:cantSplit/>
+        </w:trPr>
         <w:tc>
           <w:tcPr>
-            <w:tcW w:type="dxa" w:w="2160"/>
+            <w:tcW w:type="dxa" w:w="1206"/>
           </w:tcPr>
           <w:p>
             <w:r>
@@ -1868,7 +1799,7 @@
         </w:tc>
         <w:tc>
           <w:tcPr>
-            <w:tcW w:type="dxa" w:w="2160"/>
+            <w:tcW w:type="dxa" w:w="2813"/>
           </w:tcPr>
           <w:p>
             <w:r>
@@ -1878,7 +1809,7 @@
         </w:tc>
         <w:tc>
           <w:tcPr>
-            <w:tcW w:type="dxa" w:w="2160"/>
+            <w:tcW w:type="dxa" w:w="2411"/>
           </w:tcPr>
           <w:p>
             <w:r>
@@ -1888,7 +1819,7 @@
         </w:tc>
         <w:tc>
           <w:tcPr>
-            <w:tcW w:type="dxa" w:w="2160"/>
+            <w:tcW w:type="dxa" w:w="2210"/>
           </w:tcPr>
           <w:p>
             <w:r>
@@ -1898,9 +1829,12 @@
         </w:tc>
       </w:tr>
       <w:tr>
+        <w:trPr>
+          <w:cantSplit/>
+        </w:trPr>
         <w:tc>
           <w:tcPr>
-            <w:tcW w:type="dxa" w:w="2160"/>
+            <w:tcW w:type="dxa" w:w="1206"/>
             <w:shd w:val="clear" w:fill="F4F6FB"/>
           </w:tcPr>
           <w:p>
@@ -1911,7 +1845,7 @@
         </w:tc>
         <w:tc>
           <w:tcPr>
-            <w:tcW w:type="dxa" w:w="2160"/>
+            <w:tcW w:type="dxa" w:w="2813"/>
             <w:shd w:val="clear" w:fill="F4F6FB"/>
           </w:tcPr>
           <w:p>
@@ -1922,7 +1856,7 @@
         </w:tc>
         <w:tc>
           <w:tcPr>
-            <w:tcW w:type="dxa" w:w="2160"/>
+            <w:tcW w:type="dxa" w:w="2411"/>
             <w:shd w:val="clear" w:fill="F4F6FB"/>
           </w:tcPr>
           <w:p>
@@ -1933,7 +1867,7 @@
         </w:tc>
         <w:tc>
           <w:tcPr>
-            <w:tcW w:type="dxa" w:w="2160"/>
+            <w:tcW w:type="dxa" w:w="2210"/>
             <w:shd w:val="clear" w:fill="F4F6FB"/>
           </w:tcPr>
           <w:p>
@@ -1944,9 +1878,12 @@
         </w:tc>
       </w:tr>
       <w:tr>
+        <w:trPr>
+          <w:cantSplit/>
+        </w:trPr>
         <w:tc>
           <w:tcPr>
-            <w:tcW w:type="dxa" w:w="2160"/>
+            <w:tcW w:type="dxa" w:w="1206"/>
           </w:tcPr>
           <w:p>
             <w:r>
@@ -1956,7 +1893,7 @@
         </w:tc>
         <w:tc>
           <w:tcPr>
-            <w:tcW w:type="dxa" w:w="2160"/>
+            <w:tcW w:type="dxa" w:w="2813"/>
           </w:tcPr>
           <w:p>
             <w:r>
@@ -1966,7 +1903,7 @@
         </w:tc>
         <w:tc>
           <w:tcPr>
-            <w:tcW w:type="dxa" w:w="2160"/>
+            <w:tcW w:type="dxa" w:w="2411"/>
           </w:tcPr>
           <w:p>
             <w:r>
@@ -1976,7 +1913,7 @@
         </w:tc>
         <w:tc>
           <w:tcPr>
-            <w:tcW w:type="dxa" w:w="2160"/>
+            <w:tcW w:type="dxa" w:w="2210"/>
           </w:tcPr>
           <w:p>
             <w:r>
@@ -1986,9 +1923,12 @@
         </w:tc>
       </w:tr>
       <w:tr>
+        <w:trPr>
+          <w:cantSplit/>
+        </w:trPr>
         <w:tc>
           <w:tcPr>
-            <w:tcW w:type="dxa" w:w="2160"/>
+            <w:tcW w:type="dxa" w:w="1206"/>
             <w:shd w:val="clear" w:fill="F4F6FB"/>
           </w:tcPr>
           <w:p>
@@ -1999,7 +1939,7 @@
         </w:tc>
         <w:tc>
           <w:tcPr>
-            <w:tcW w:type="dxa" w:w="2160"/>
+            <w:tcW w:type="dxa" w:w="2813"/>
             <w:shd w:val="clear" w:fill="F4F6FB"/>
           </w:tcPr>
           <w:p>
@@ -2010,7 +1950,7 @@
         </w:tc>
         <w:tc>
           <w:tcPr>
-            <w:tcW w:type="dxa" w:w="2160"/>
+            <w:tcW w:type="dxa" w:w="2411"/>
             <w:shd w:val="clear" w:fill="F4F6FB"/>
           </w:tcPr>
           <w:p>
@@ -2021,7 +1961,7 @@
         </w:tc>
         <w:tc>
           <w:tcPr>
-            <w:tcW w:type="dxa" w:w="2160"/>
+            <w:tcW w:type="dxa" w:w="2210"/>
             <w:shd w:val="clear" w:fill="F4F6FB"/>
           </w:tcPr>
           <w:p>
@@ -2036,6 +1976,7 @@
     <w:p>
       <w:pPr>
         <w:pStyle w:val="Heading1"/>
+        <w:keepNext/>
       </w:pPr>
       <w:r>
         <w:t>Sources</w:t>
@@ -2048,7 +1989,7 @@
         </w:rPr>
         <w:t xml:space="preserve">1. Future of Work 2026 — industry survey, </w:t>
       </w:r>
-      <w:hyperlink r:id="rId9">
+      <w:hyperlink r:id="rId11">
         <w:r>
           <w:rPr>
             <w:color w:val="4F46E5"/>

</xml_diff>